<commit_message>
docs: add full SSO process and Revogar SSO to the Portal guide
Document the end-to-end Microsoft login (IDENT→START→AZURE→BIND→FIRST/LINK→session) and the Application Revogar SSO flow, including the TCS_LOG_ACESSO_AUTH codes, in the user guide, API catalog, and Word document.

Co-authored-by: andre.vilmo <andre.vilmo@gmail.com>
</commit_message>
<xml_diff>
--- a/docs/Linx-UX-MFA-SSO-Portal.docx
+++ b/docs/Linx-UX-MFA-SSO-Portal.docx
@@ -57,7 +57,7 @@
           <w:color w:val="334155"/>
           <w:sz w:val="22"/>
         </w:rPr>
-        <w:t>Este documento tem duas partes independentes. A Parte 1 é para quem usa ou apresenta o Portal. A Parte 2 é para TI da empresa e implantação: o que obter no Azure, o que gravar no Web.config e o que marcar no cadastro Linx.</w:t>
+        <w:t>Este documento tem três partes. A Parte 1 é a jornada no Portal (senha ou Microsoft + MFA). A Parte 1b descreve o processo completo de SSO e o processo de Revogar SSO. A Parte 2 é para TI da empresa: Azure, Web.config e cadastro Linx.</w:t>
       </w:r>
     </w:p>
     <w:p>
@@ -917,6 +917,1631 @@
           <w:sz w:val="22"/>
         </w:rPr>
         <w:t>Revogar SSO — apaga só o vínculo Azure. Senha e TOTP permanecem.</w:t>
+      </w:r>
+    </w:p>
+    <w:p>
+      <w:pPr>
+        <w:spacing w:before="320" w:after="120"/>
+      </w:pPr>
+      <w:r>
+        <w:rPr>
+          <w:rFonts w:ascii="Calibri" w:hAnsi="Calibri" w:eastAsia="Calibri"/>
+          <w:b/>
+          <w:color w:val="0B2545"/>
+          <w:sz w:val="36"/>
+        </w:rPr>
+        <w:t>Parte 1b — Processo completo de SSO e Revogar SSO</w:t>
+      </w:r>
+    </w:p>
+    <w:p>
+      <w:pPr>
+        <w:spacing w:after="160" w:line="276" w:lineRule="auto"/>
+      </w:pPr>
+      <w:r>
+        <w:rPr>
+          <w:rFonts w:ascii="Calibri" w:hAnsi="Calibri" w:eastAsia="Calibri"/>
+          <w:b w:val="0"/>
+          <w:color w:val="334155"/>
+          <w:sz w:val="22"/>
+        </w:rPr>
+        <w:t>O botão “entrar com Microsoft” não é um clique único. Ele amarra o login digitado no CONTINUAR à conta Azure (OID + UPN), abre a sessão do Portal e só então segue para ambiente e MFA. Revogar SSO é o caminho inverso no cadastro: apaga o vínculo sem mexer em senha nem TOTP.</w:t>
+      </w:r>
+    </w:p>
+    <w:p>
+      <w:pPr>
+        <w:spacing w:before="120" w:after="40"/>
+        <w:jc w:val="center"/>
+      </w:pPr>
+      <w:r>
+        <w:drawing>
+          <wp:inline xmlns:a="http://schemas.openxmlformats.org/drawingml/2006/main" xmlns:pic="http://schemas.openxmlformats.org/drawingml/2006/picture">
+            <wp:extent cx="5903999" cy="1918800"/>
+            <wp:docPr id="10" name="Picture 10"/>
+            <wp:cNvGraphicFramePr>
+              <a:graphicFrameLocks noChangeAspect="1"/>
+            </wp:cNvGraphicFramePr>
+            <a:graphic>
+              <a:graphicData uri="http://schemas.openxmlformats.org/drawingml/2006/picture">
+                <pic:pic>
+                  <pic:nvPicPr>
+                    <pic:cNvPr id="0" name="jornada-sso.png"/>
+                    <pic:cNvPicPr/>
+                  </pic:nvPicPr>
+                  <pic:blipFill>
+                    <a:blip r:embed="rId18"/>
+                    <a:stretch>
+                      <a:fillRect/>
+                    </a:stretch>
+                  </pic:blipFill>
+                  <pic:spPr>
+                    <a:xfrm>
+                      <a:off x="0" y="0"/>
+                      <a:ext cx="5903999" cy="1918800"/>
+                    </a:xfrm>
+                    <a:prstGeom prst="rect"/>
+                  </pic:spPr>
+                </pic:pic>
+              </a:graphicData>
+            </a:graphic>
+          </wp:inline>
+        </w:drawing>
+      </w:r>
+    </w:p>
+    <w:p>
+      <w:pPr>
+        <w:spacing w:after="240"/>
+        <w:jc w:val="center"/>
+      </w:pPr>
+      <w:r>
+        <w:rPr>
+          <w:rFonts w:ascii="Calibri" w:hAnsi="Calibri" w:eastAsia="Calibri"/>
+          <w:b w:val="0"/>
+          <w:color w:val="64748B"/>
+          <w:sz w:val="18"/>
+        </w:rPr>
+        <w:t>Figura 10 — Processo SSO completo (passos 1–5 no Portal) e Revogar SSO (passo 6 no Application).</w:t>
+      </w:r>
+    </w:p>
+    <w:p>
+      <w:pPr>
+        <w:spacing w:before="200" w:after="120"/>
+      </w:pPr>
+      <w:r>
+        <w:rPr>
+          <w:rFonts w:ascii="Calibri" w:hAnsi="Calibri" w:eastAsia="Calibri"/>
+          <w:b/>
+          <w:color w:val="5B2E90"/>
+          <w:sz w:val="26"/>
+        </w:rPr>
+        <w:t>8. Processo completo de SSO</w:t>
+      </w:r>
+    </w:p>
+    <w:p>
+      <w:pPr>
+        <w:spacing w:after="160" w:line="276" w:lineRule="auto"/>
+      </w:pPr>
+      <w:r>
+        <w:rPr>
+          <w:rFonts w:ascii="Calibri" w:hAnsi="Calibri" w:eastAsia="Calibri"/>
+          <w:b w:val="0"/>
+          <w:color w:val="334155"/>
+          <w:sz w:val="22"/>
+        </w:rPr>
+        <w:t>A identidade no Linx continua sendo o Nome de autenticação digitado no CONTINUAR, não o prefixo do e-mail Microsoft. O token Azure não vai ao Service.</w:t>
+      </w:r>
+    </w:p>
+    <w:p>
+      <w:pPr>
+        <w:pStyle w:val="ListBullet"/>
+      </w:pPr>
+      <w:r>
+        <w:rPr>
+          <w:rFonts w:ascii="Calibri" w:hAnsi="Calibri" w:eastAsia="Calibri"/>
+          <w:b w:val="0"/>
+          <w:color w:val="334155"/>
+          <w:sz w:val="22"/>
+        </w:rPr>
+        <w:t>CONTINUAR — o Portal consulta Utiliza SSO, e-mail e usuário de serviço. Usuário de serviço é recusado. Com SSO ligado, guarda o login e o e-mail (dica da Microsoft).</w:t>
+      </w:r>
+    </w:p>
+    <w:p>
+      <w:pPr>
+        <w:pStyle w:val="ListBullet"/>
+      </w:pPr>
+      <w:r>
+        <w:rPr>
+          <w:rFonts w:ascii="Calibri" w:hAnsi="Calibri" w:eastAsia="Calibri"/>
+          <w:b w:val="0"/>
+          <w:color w:val="334155"/>
+          <w:sz w:val="22"/>
+        </w:rPr>
+        <w:t>Entrar com Microsoft — redirect para login.microsoftonline.com com prompt=login. Se houver e-mail no cadastro, ele vai como login_hint.</w:t>
+      </w:r>
+    </w:p>
+    <w:p>
+      <w:pPr>
+        <w:pStyle w:val="ListBullet"/>
+      </w:pPr>
+      <w:r>
+        <w:rPr>
+          <w:rFonts w:ascii="Calibri" w:hAnsi="Calibri" w:eastAsia="Calibri"/>
+          <w:b w:val="0"/>
+          <w:color w:val="334155"/>
+          <w:sz w:val="22"/>
+        </w:rPr>
+        <w:t>Volta ao Portal — a Microsoft devolve o code. O Portal troca o code pelo perfil (OID + UPN).</w:t>
+      </w:r>
+    </w:p>
+    <w:p>
+      <w:pPr>
+        <w:pStyle w:val="ListBullet"/>
+      </w:pPr>
+      <w:r>
+        <w:rPr>
+          <w:rFonts w:ascii="Calibri" w:hAnsi="Calibri" w:eastAsia="Calibri"/>
+          <w:b w:val="0"/>
+          <w:color w:val="334155"/>
+          <w:sz w:val="22"/>
+        </w:rPr>
+        <w:t>Primeiro vínculo — o Service insere AZURE_OID + AZURE_UPN em TCS_USUARIO_SSO_VINCULO.</w:t>
+      </w:r>
+    </w:p>
+    <w:p>
+      <w:pPr>
+        <w:pStyle w:val="ListBullet"/>
+      </w:pPr>
+      <w:r>
+        <w:rPr>
+          <w:rFonts w:ascii="Calibri" w:hAnsi="Calibri" w:eastAsia="Calibri"/>
+          <w:b w:val="0"/>
+          <w:color w:val="334155"/>
+          <w:sz w:val="22"/>
+        </w:rPr>
+        <w:t>Mesma conta — atualiza só DATA_ULTIMO_LOGIN.</w:t>
+      </w:r>
+    </w:p>
+    <w:p>
+      <w:pPr>
+        <w:pStyle w:val="ListBullet"/>
+      </w:pPr>
+      <w:r>
+        <w:rPr>
+          <w:rFonts w:ascii="Calibri" w:hAnsi="Calibri" w:eastAsia="Calibri"/>
+          <w:b w:val="0"/>
+          <w:color w:val="334155"/>
+          <w:sz w:val="22"/>
+        </w:rPr>
+        <w:t>Conta Microsoft diferente — recusa, não abre sessão e volta ao CONTINUAR (Figura 5).</w:t>
+      </w:r>
+    </w:p>
+    <w:p>
+      <w:pPr>
+        <w:pStyle w:val="ListBullet"/>
+      </w:pPr>
+      <w:r>
+        <w:rPr>
+          <w:rFonts w:ascii="Calibri" w:hAnsi="Calibri" w:eastAsia="Calibri"/>
+          <w:b w:val="0"/>
+          <w:color w:val="334155"/>
+          <w:sz w:val="22"/>
+        </w:rPr>
+        <w:t>OID já de outro usuário Linx — recusa o bind.</w:t>
+      </w:r>
+    </w:p>
+    <w:p>
+      <w:pPr>
+        <w:pStyle w:val="ListBullet"/>
+      </w:pPr>
+      <w:r>
+        <w:rPr>
+          <w:rFonts w:ascii="Calibri" w:hAnsi="Calibri" w:eastAsia="Calibri"/>
+          <w:b w:val="0"/>
+          <w:color w:val="334155"/>
+          <w:sz w:val="22"/>
+        </w:rPr>
+        <w:t>Sessão — só depois do vínculo aceito o Service autentica sem senha e o Portal grava o cookie.</w:t>
+      </w:r>
+    </w:p>
+    <w:p>
+      <w:pPr>
+        <w:pStyle w:val="ListBullet"/>
+      </w:pPr>
+      <w:r>
+        <w:rPr>
+          <w:rFonts w:ascii="Calibri" w:hAnsi="Calibri" w:eastAsia="Calibri"/>
+          <w:b w:val="0"/>
+          <w:color w:val="334155"/>
+          <w:sz w:val="22"/>
+        </w:rPr>
+        <w:t>Ambiente e MFA — iguais ao caminho de senha. SSO não dispensa o código de 6 dígitos.</w:t>
+      </w:r>
+    </w:p>
+    <w:p>
+      <w:pPr>
+        <w:spacing w:before="200" w:after="120"/>
+      </w:pPr>
+      <w:r>
+        <w:rPr>
+          <w:rFonts w:ascii="Calibri" w:hAnsi="Calibri" w:eastAsia="Calibri"/>
+          <w:b/>
+          <w:color w:val="5B2E90"/>
+          <w:sz w:val="26"/>
+        </w:rPr>
+        <w:t>9. Processo de Revogar SSO</w:t>
+      </w:r>
+    </w:p>
+    <w:p>
+      <w:pPr>
+        <w:spacing w:after="160" w:line="276" w:lineRule="auto"/>
+      </w:pPr>
+      <w:r>
+        <w:rPr>
+          <w:rFonts w:ascii="Calibri" w:hAnsi="Calibri" w:eastAsia="Calibri"/>
+          <w:b w:val="0"/>
+          <w:color w:val="334155"/>
+          <w:sz w:val="22"/>
+        </w:rPr>
+        <w:t>Revogar SSO fica no cadastro de usuário (Application), ao lado de Revogar MFA. O ícone da barra de ferramentas só aparece quando aquele usuário já tem vínculo. O botão do formulário permanece visível; se não houver vínculo, o sistema avisa.</w:t>
+      </w:r>
+    </w:p>
+    <w:p>
+      <w:pPr>
+        <w:pStyle w:val="ListBullet"/>
+      </w:pPr>
+      <w:r>
+        <w:rPr>
+          <w:rFonts w:ascii="Calibri" w:hAnsi="Calibri" w:eastAsia="Calibri"/>
+          <w:b w:val="0"/>
+          <w:color w:val="334155"/>
+          <w:sz w:val="22"/>
+        </w:rPr>
+        <w:t>Abra o cadastro do usuário (local ou de autenticação).</w:t>
+      </w:r>
+    </w:p>
+    <w:p>
+      <w:pPr>
+        <w:pStyle w:val="ListBullet"/>
+      </w:pPr>
+      <w:r>
+        <w:rPr>
+          <w:rFonts w:ascii="Calibri" w:hAnsi="Calibri" w:eastAsia="Calibri"/>
+          <w:b w:val="0"/>
+          <w:color w:val="334155"/>
+          <w:sz w:val="22"/>
+        </w:rPr>
+        <w:t>Clique em Revogar SSO.</w:t>
+      </w:r>
+    </w:p>
+    <w:p>
+      <w:pPr>
+        <w:pStyle w:val="ListBullet"/>
+      </w:pPr>
+      <w:r>
+        <w:rPr>
+          <w:rFonts w:ascii="Calibri" w:hAnsi="Calibri" w:eastAsia="Calibri"/>
+          <w:b w:val="0"/>
+          <w:color w:val="334155"/>
+          <w:sz w:val="22"/>
+        </w:rPr>
+        <w:t>Confirme a mensagem: remove só o vínculo da conta Microsoft; o próximo SSO grava um OID/UPN novo.</w:t>
+      </w:r>
+    </w:p>
+    <w:p>
+      <w:pPr>
+        <w:pStyle w:val="ListBullet"/>
+      </w:pPr>
+      <w:r>
+        <w:rPr>
+          <w:rFonts w:ascii="Calibri" w:hAnsi="Calibri" w:eastAsia="Calibri"/>
+          <w:b w:val="0"/>
+          <w:color w:val="334155"/>
+          <w:sz w:val="22"/>
+        </w:rPr>
+        <w:t>O Service apaga a linha em TCS_USUARIO_SSO_VINCULO. Senha Linx, secret MFA e as flags Utiliza SSO / Utiliza MFA não mudam.</w:t>
+      </w:r>
+    </w:p>
+    <w:p>
+      <w:pPr>
+        <w:pStyle w:val="ListBullet"/>
+      </w:pPr>
+      <w:r>
+        <w:rPr>
+          <w:rFonts w:ascii="Calibri" w:hAnsi="Calibri" w:eastAsia="Calibri"/>
+          <w:b w:val="0"/>
+          <w:color w:val="334155"/>
+          <w:sz w:val="22"/>
+        </w:rPr>
+        <w:t>No próximo CONTINUAR → Microsoft o Linx grava um vínculo novo com a conta Azure usada naquele momento.</w:t>
+      </w:r>
+    </w:p>
+    <w:p>
+      <w:pPr>
+        <w:spacing w:before="120" w:after="40"/>
+        <w:jc w:val="center"/>
+      </w:pPr>
+      <w:r>
+        <w:drawing>
+          <wp:inline xmlns:a="http://schemas.openxmlformats.org/drawingml/2006/main" xmlns:pic="http://schemas.openxmlformats.org/drawingml/2006/picture">
+            <wp:extent cx="5903999" cy="3525999"/>
+            <wp:docPr id="11" name="Picture 11"/>
+            <wp:cNvGraphicFramePr>
+              <a:graphicFrameLocks noChangeAspect="1"/>
+            </wp:cNvGraphicFramePr>
+            <a:graphic>
+              <a:graphicData uri="http://schemas.openxmlformats.org/drawingml/2006/picture">
+                <pic:pic>
+                  <pic:nvPicPr>
+                    <pic:cNvPr id="0" name="tela-revogar-sso.png"/>
+                    <pic:cNvPicPr/>
+                  </pic:nvPicPr>
+                  <pic:blipFill>
+                    <a:blip r:embed="rId19"/>
+                    <a:stretch>
+                      <a:fillRect/>
+                    </a:stretch>
+                  </pic:blipFill>
+                  <pic:spPr>
+                    <a:xfrm>
+                      <a:off x="0" y="0"/>
+                      <a:ext cx="5903999" cy="3525999"/>
+                    </a:xfrm>
+                    <a:prstGeom prst="rect"/>
+                  </pic:spPr>
+                </pic:pic>
+              </a:graphicData>
+            </a:graphic>
+          </wp:inline>
+        </w:drawing>
+      </w:r>
+    </w:p>
+    <w:p>
+      <w:pPr>
+        <w:spacing w:after="240"/>
+        <w:jc w:val="center"/>
+      </w:pPr>
+      <w:r>
+        <w:rPr>
+          <w:rFonts w:ascii="Calibri" w:hAnsi="Calibri" w:eastAsia="Calibri"/>
+          <w:b w:val="0"/>
+          <w:color w:val="64748B"/>
+          <w:sz w:val="18"/>
+        </w:rPr>
+        <w:t>Figura 11 — Confirmação de Revogar SSO no cadastro.</w:t>
+      </w:r>
+    </w:p>
+    <w:p>
+      <w:pPr>
+        <w:spacing w:before="120" w:after="40"/>
+        <w:jc w:val="center"/>
+      </w:pPr>
+      <w:r>
+        <w:drawing>
+          <wp:inline xmlns:a="http://schemas.openxmlformats.org/drawingml/2006/main" xmlns:pic="http://schemas.openxmlformats.org/drawingml/2006/picture">
+            <wp:extent cx="5903999" cy="3525999"/>
+            <wp:docPr id="12" name="Picture 12"/>
+            <wp:cNvGraphicFramePr>
+              <a:graphicFrameLocks noChangeAspect="1"/>
+            </wp:cNvGraphicFramePr>
+            <a:graphic>
+              <a:graphicData uri="http://schemas.openxmlformats.org/drawingml/2006/picture">
+                <pic:pic>
+                  <pic:nvPicPr>
+                    <pic:cNvPr id="0" name="tela-revogar-sso-ok.png"/>
+                    <pic:cNvPicPr/>
+                  </pic:nvPicPr>
+                  <pic:blipFill>
+                    <a:blip r:embed="rId20"/>
+                    <a:stretch>
+                      <a:fillRect/>
+                    </a:stretch>
+                  </pic:blipFill>
+                  <pic:spPr>
+                    <a:xfrm>
+                      <a:off x="0" y="0"/>
+                      <a:ext cx="5903999" cy="3525999"/>
+                    </a:xfrm>
+                    <a:prstGeom prst="rect"/>
+                  </pic:spPr>
+                </pic:pic>
+              </a:graphicData>
+            </a:graphic>
+          </wp:inline>
+        </w:drawing>
+      </w:r>
+    </w:p>
+    <w:p>
+      <w:pPr>
+        <w:spacing w:after="240"/>
+        <w:jc w:val="center"/>
+      </w:pPr>
+      <w:r>
+        <w:rPr>
+          <w:rFonts w:ascii="Calibri" w:hAnsi="Calibri" w:eastAsia="Calibri"/>
+          <w:b w:val="0"/>
+          <w:color w:val="64748B"/>
+          <w:sz w:val="18"/>
+        </w:rPr>
+        <w:t>Figura 12 — SSO revogado: o próximo login Microsoft cria o vínculo de novo.</w:t>
+      </w:r>
+    </w:p>
+    <w:p>
+      <w:pPr>
+        <w:spacing w:after="160" w:line="276" w:lineRule="auto"/>
+      </w:pPr>
+      <w:r>
+        <w:rPr>
+          <w:rFonts w:ascii="Calibri" w:hAnsi="Calibri" w:eastAsia="Calibri"/>
+          <w:b w:val="0"/>
+          <w:color w:val="334155"/>
+          <w:sz w:val="22"/>
+        </w:rPr>
+        <w:t>Use quando a pessoa trocou de conta Microsoft, quando o vínculo ficou com a conta errada, ou depois de um acesso recusado (“conta Microsoft diferente da vinculada”).</w:t>
+      </w:r>
+    </w:p>
+    <w:p>
+      <w:pPr>
+        <w:spacing w:before="200" w:after="120"/>
+      </w:pPr>
+      <w:r>
+        <w:rPr>
+          <w:rFonts w:ascii="Calibri" w:hAnsi="Calibri" w:eastAsia="Calibri"/>
+          <w:b/>
+          <w:color w:val="5B2E90"/>
+          <w:sz w:val="26"/>
+        </w:rPr>
+        <w:t>10. O que fica gravado em TCS_LOG_ACESSO_AUTH</w:t>
+      </w:r>
+    </w:p>
+    <w:p>
+      <w:pPr>
+        <w:spacing w:after="160" w:line="276" w:lineRule="auto"/>
+      </w:pPr>
+      <w:r>
+        <w:rPr>
+          <w:rFonts w:ascii="Calibri" w:hAnsi="Calibri" w:eastAsia="Calibri"/>
+          <w:b w:val="0"/>
+          <w:color w:val="334155"/>
+          <w:sz w:val="22"/>
+        </w:rPr>
+        <w:t>Todo o processo de SSO e o Revogar SSO escrevem na tabela TCS_LOG_ACESSO_AUTH, canal PortalSSO. MFA TOTP não grava nesta tabela. Falhas SSOI/SSOF não contam para lockout de senha.</w:t>
+      </w:r>
+    </w:p>
+    <w:tbl>
+      <w:tblPr>
+        <w:tblW w:type="auto" w:w="0"/>
+        <w:jc w:val="center"/>
+        <w:tblLayout w:type="fixed"/>
+        <w:tblLook w:firstColumn="1" w:firstRow="1" w:lastColumn="0" w:lastRow="0" w:noHBand="0" w:noVBand="1" w:val="04A0"/>
+      </w:tblPr>
+      <w:tblGrid>
+        <w:gridCol w:w="3362"/>
+        <w:gridCol w:w="3362"/>
+        <w:gridCol w:w="3362"/>
+      </w:tblGrid>
+      <w:tr>
+        <w:tc>
+          <w:tcPr>
+            <w:tcW w:type="dxa" w:w="2948"/>
+            <w:shd w:fill="5B2E90" w:val="clear"/>
+            <w:tcBorders>
+              <w:top w:val="single" w:sz="4" w:color="CBD5E1"/>
+              <w:left w:val="single" w:sz="4" w:color="CBD5E1"/>
+              <w:bottom w:val="single" w:sz="4" w:color="CBD5E1"/>
+              <w:right w:val="single" w:sz="4" w:color="CBD5E1"/>
+            </w:tcBorders>
+          </w:tcPr>
+          <w:p>
+            <w:r/>
+            <w:r>
+              <w:rPr>
+                <w:rFonts w:ascii="Calibri" w:hAnsi="Calibri" w:eastAsia="Calibri"/>
+                <w:b/>
+                <w:color w:val="FFFFFF"/>
+                <w:sz w:val="20"/>
+              </w:rPr>
+              <w:t>Código</w:t>
+            </w:r>
+          </w:p>
+        </w:tc>
+        <w:tc>
+          <w:tcPr>
+            <w:tcW w:type="dxa" w:w="907"/>
+            <w:shd w:fill="5B2E90" w:val="clear"/>
+            <w:tcBorders>
+              <w:top w:val="single" w:sz="4" w:color="CBD5E1"/>
+              <w:left w:val="single" w:sz="4" w:color="CBD5E1"/>
+              <w:bottom w:val="single" w:sz="4" w:color="CBD5E1"/>
+              <w:right w:val="single" w:sz="4" w:color="CBD5E1"/>
+            </w:tcBorders>
+          </w:tcPr>
+          <w:p>
+            <w:r/>
+            <w:r>
+              <w:rPr>
+                <w:rFonts w:ascii="Calibri" w:hAnsi="Calibri" w:eastAsia="Calibri"/>
+                <w:b/>
+                <w:color w:val="FFFFFF"/>
+                <w:sz w:val="20"/>
+              </w:rPr>
+              <w:t>Tipo</w:t>
+            </w:r>
+          </w:p>
+        </w:tc>
+        <w:tc>
+          <w:tcPr>
+            <w:tcW w:type="dxa" w:w="5556"/>
+            <w:shd w:fill="5B2E90" w:val="clear"/>
+            <w:tcBorders>
+              <w:top w:val="single" w:sz="4" w:color="CBD5E1"/>
+              <w:left w:val="single" w:sz="4" w:color="CBD5E1"/>
+              <w:bottom w:val="single" w:sz="4" w:color="CBD5E1"/>
+              <w:right w:val="single" w:sz="4" w:color="CBD5E1"/>
+            </w:tcBorders>
+          </w:tcPr>
+          <w:p>
+            <w:r/>
+            <w:r>
+              <w:rPr>
+                <w:rFonts w:ascii="Calibri" w:hAnsi="Calibri" w:eastAsia="Calibri"/>
+                <w:b/>
+                <w:color w:val="FFFFFF"/>
+                <w:sz w:val="20"/>
+              </w:rPr>
+              <w:t>Processo</w:t>
+            </w:r>
+          </w:p>
+        </w:tc>
+      </w:tr>
+      <w:tr>
+        <w:tc>
+          <w:tcPr>
+            <w:tcW w:type="dxa" w:w="2948"/>
+            <w:shd w:fill="F8FAFC" w:val="clear"/>
+            <w:tcBorders>
+              <w:top w:val="single" w:sz="4" w:color="CBD5E1"/>
+              <w:left w:val="single" w:sz="4" w:color="CBD5E1"/>
+              <w:bottom w:val="single" w:sz="4" w:color="CBD5E1"/>
+              <w:right w:val="single" w:sz="4" w:color="CBD5E1"/>
+            </w:tcBorders>
+          </w:tcPr>
+          <w:p>
+            <w:r/>
+            <w:r>
+              <w:rPr>
+                <w:rFonts w:ascii="Calibri" w:hAnsi="Calibri" w:eastAsia="Calibri"/>
+                <w:b/>
+                <w:color w:val="334155"/>
+                <w:sz w:val="19"/>
+              </w:rPr>
+              <w:t>SSOI-IDENT</w:t>
+            </w:r>
+          </w:p>
+        </w:tc>
+        <w:tc>
+          <w:tcPr>
+            <w:tcW w:type="dxa" w:w="907"/>
+            <w:shd w:fill="F8FAFC" w:val="clear"/>
+            <w:tcBorders>
+              <w:top w:val="single" w:sz="4" w:color="CBD5E1"/>
+              <w:left w:val="single" w:sz="4" w:color="CBD5E1"/>
+              <w:bottom w:val="single" w:sz="4" w:color="CBD5E1"/>
+              <w:right w:val="single" w:sz="4" w:color="CBD5E1"/>
+            </w:tcBorders>
+          </w:tcPr>
+          <w:p>
+            <w:r/>
+            <w:r>
+              <w:rPr>
+                <w:rFonts w:ascii="Calibri" w:hAnsi="Calibri" w:eastAsia="Calibri"/>
+                <w:b w:val="0"/>
+                <w:color w:val="334155"/>
+                <w:sz w:val="19"/>
+              </w:rPr>
+              <w:t>I</w:t>
+            </w:r>
+          </w:p>
+        </w:tc>
+        <w:tc>
+          <w:tcPr>
+            <w:tcW w:type="dxa" w:w="5556"/>
+            <w:shd w:fill="F8FAFC" w:val="clear"/>
+            <w:tcBorders>
+              <w:top w:val="single" w:sz="4" w:color="CBD5E1"/>
+              <w:left w:val="single" w:sz="4" w:color="CBD5E1"/>
+              <w:bottom w:val="single" w:sz="4" w:color="CBD5E1"/>
+              <w:right w:val="single" w:sz="4" w:color="CBD5E1"/>
+            </w:tcBorders>
+          </w:tcPr>
+          <w:p>
+            <w:r/>
+            <w:r>
+              <w:rPr>
+                <w:rFonts w:ascii="Calibri" w:hAnsi="Calibri" w:eastAsia="Calibri"/>
+                <w:b w:val="0"/>
+                <w:color w:val="334155"/>
+                <w:sz w:val="19"/>
+              </w:rPr>
+              <w:t>CONTINUAR com Utiliza SSO (e-mail do login_hint)</w:t>
+            </w:r>
+          </w:p>
+        </w:tc>
+      </w:tr>
+      <w:tr>
+        <w:tc>
+          <w:tcPr>
+            <w:tcW w:type="dxa" w:w="2948"/>
+            <w:shd w:fill="EEF2FF" w:val="clear"/>
+            <w:tcBorders>
+              <w:top w:val="single" w:sz="4" w:color="CBD5E1"/>
+              <w:left w:val="single" w:sz="4" w:color="CBD5E1"/>
+              <w:bottom w:val="single" w:sz="4" w:color="CBD5E1"/>
+              <w:right w:val="single" w:sz="4" w:color="CBD5E1"/>
+            </w:tcBorders>
+          </w:tcPr>
+          <w:p>
+            <w:r/>
+            <w:r>
+              <w:rPr>
+                <w:rFonts w:ascii="Calibri" w:hAnsi="Calibri" w:eastAsia="Calibri"/>
+                <w:b/>
+                <w:color w:val="334155"/>
+                <w:sz w:val="19"/>
+              </w:rPr>
+              <w:t>SSOI-START</w:t>
+            </w:r>
+          </w:p>
+        </w:tc>
+        <w:tc>
+          <w:tcPr>
+            <w:tcW w:type="dxa" w:w="907"/>
+            <w:shd w:fill="EEF2FF" w:val="clear"/>
+            <w:tcBorders>
+              <w:top w:val="single" w:sz="4" w:color="CBD5E1"/>
+              <w:left w:val="single" w:sz="4" w:color="CBD5E1"/>
+              <w:bottom w:val="single" w:sz="4" w:color="CBD5E1"/>
+              <w:right w:val="single" w:sz="4" w:color="CBD5E1"/>
+            </w:tcBorders>
+          </w:tcPr>
+          <w:p>
+            <w:r/>
+            <w:r>
+              <w:rPr>
+                <w:rFonts w:ascii="Calibri" w:hAnsi="Calibri" w:eastAsia="Calibri"/>
+                <w:b w:val="0"/>
+                <w:color w:val="334155"/>
+                <w:sz w:val="19"/>
+              </w:rPr>
+              <w:t>I</w:t>
+            </w:r>
+          </w:p>
+        </w:tc>
+        <w:tc>
+          <w:tcPr>
+            <w:tcW w:type="dxa" w:w="5556"/>
+            <w:shd w:fill="EEF2FF" w:val="clear"/>
+            <w:tcBorders>
+              <w:top w:val="single" w:sz="4" w:color="CBD5E1"/>
+              <w:left w:val="single" w:sz="4" w:color="CBD5E1"/>
+              <w:bottom w:val="single" w:sz="4" w:color="CBD5E1"/>
+              <w:right w:val="single" w:sz="4" w:color="CBD5E1"/>
+            </w:tcBorders>
+          </w:tcPr>
+          <w:p>
+            <w:r/>
+            <w:r>
+              <w:rPr>
+                <w:rFonts w:ascii="Calibri" w:hAnsi="Calibri" w:eastAsia="Calibri"/>
+                <w:b w:val="0"/>
+                <w:color w:val="334155"/>
+                <w:sz w:val="19"/>
+              </w:rPr>
+              <w:t>Redirect para a Microsoft</w:t>
+            </w:r>
+          </w:p>
+        </w:tc>
+      </w:tr>
+      <w:tr>
+        <w:tc>
+          <w:tcPr>
+            <w:tcW w:type="dxa" w:w="2948"/>
+            <w:shd w:fill="F8FAFC" w:val="clear"/>
+            <w:tcBorders>
+              <w:top w:val="single" w:sz="4" w:color="CBD5E1"/>
+              <w:left w:val="single" w:sz="4" w:color="CBD5E1"/>
+              <w:bottom w:val="single" w:sz="4" w:color="CBD5E1"/>
+              <w:right w:val="single" w:sz="4" w:color="CBD5E1"/>
+            </w:tcBorders>
+          </w:tcPr>
+          <w:p>
+            <w:r/>
+            <w:r>
+              <w:rPr>
+                <w:rFonts w:ascii="Calibri" w:hAnsi="Calibri" w:eastAsia="Calibri"/>
+                <w:b/>
+                <w:color w:val="334155"/>
+                <w:sz w:val="19"/>
+              </w:rPr>
+              <w:t>SSOI-AZURE</w:t>
+            </w:r>
+          </w:p>
+        </w:tc>
+        <w:tc>
+          <w:tcPr>
+            <w:tcW w:type="dxa" w:w="907"/>
+            <w:shd w:fill="F8FAFC" w:val="clear"/>
+            <w:tcBorders>
+              <w:top w:val="single" w:sz="4" w:color="CBD5E1"/>
+              <w:left w:val="single" w:sz="4" w:color="CBD5E1"/>
+              <w:bottom w:val="single" w:sz="4" w:color="CBD5E1"/>
+              <w:right w:val="single" w:sz="4" w:color="CBD5E1"/>
+            </w:tcBorders>
+          </w:tcPr>
+          <w:p>
+            <w:r/>
+            <w:r>
+              <w:rPr>
+                <w:rFonts w:ascii="Calibri" w:hAnsi="Calibri" w:eastAsia="Calibri"/>
+                <w:b w:val="0"/>
+                <w:color w:val="334155"/>
+                <w:sz w:val="19"/>
+              </w:rPr>
+              <w:t>I</w:t>
+            </w:r>
+          </w:p>
+        </w:tc>
+        <w:tc>
+          <w:tcPr>
+            <w:tcW w:type="dxa" w:w="5556"/>
+            <w:shd w:fill="F8FAFC" w:val="clear"/>
+            <w:tcBorders>
+              <w:top w:val="single" w:sz="4" w:color="CBD5E1"/>
+              <w:left w:val="single" w:sz="4" w:color="CBD5E1"/>
+              <w:bottom w:val="single" w:sz="4" w:color="CBD5E1"/>
+              <w:right w:val="single" w:sz="4" w:color="CBD5E1"/>
+            </w:tcBorders>
+          </w:tcPr>
+          <w:p>
+            <w:r/>
+            <w:r>
+              <w:rPr>
+                <w:rFonts w:ascii="Calibri" w:hAnsi="Calibri" w:eastAsia="Calibri"/>
+                <w:b w:val="0"/>
+                <w:color w:val="334155"/>
+                <w:sz w:val="19"/>
+              </w:rPr>
+              <w:t>Callback com UPN depois de trocar o code</w:t>
+            </w:r>
+          </w:p>
+        </w:tc>
+      </w:tr>
+      <w:tr>
+        <w:tc>
+          <w:tcPr>
+            <w:tcW w:type="dxa" w:w="2948"/>
+            <w:shd w:fill="EEF2FF" w:val="clear"/>
+            <w:tcBorders>
+              <w:top w:val="single" w:sz="4" w:color="CBD5E1"/>
+              <w:left w:val="single" w:sz="4" w:color="CBD5E1"/>
+              <w:bottom w:val="single" w:sz="4" w:color="CBD5E1"/>
+              <w:right w:val="single" w:sz="4" w:color="CBD5E1"/>
+            </w:tcBorders>
+          </w:tcPr>
+          <w:p>
+            <w:r/>
+            <w:r>
+              <w:rPr>
+                <w:rFonts w:ascii="Calibri" w:hAnsi="Calibri" w:eastAsia="Calibri"/>
+                <w:b/>
+                <w:color w:val="334155"/>
+                <w:sz w:val="19"/>
+              </w:rPr>
+              <w:t>SSOI-BIND</w:t>
+            </w:r>
+          </w:p>
+        </w:tc>
+        <w:tc>
+          <w:tcPr>
+            <w:tcW w:type="dxa" w:w="907"/>
+            <w:shd w:fill="EEF2FF" w:val="clear"/>
+            <w:tcBorders>
+              <w:top w:val="single" w:sz="4" w:color="CBD5E1"/>
+              <w:left w:val="single" w:sz="4" w:color="CBD5E1"/>
+              <w:bottom w:val="single" w:sz="4" w:color="CBD5E1"/>
+              <w:right w:val="single" w:sz="4" w:color="CBD5E1"/>
+            </w:tcBorders>
+          </w:tcPr>
+          <w:p>
+            <w:r/>
+            <w:r>
+              <w:rPr>
+                <w:rFonts w:ascii="Calibri" w:hAnsi="Calibri" w:eastAsia="Calibri"/>
+                <w:b w:val="0"/>
+                <w:color w:val="334155"/>
+                <w:sz w:val="19"/>
+              </w:rPr>
+              <w:t>I</w:t>
+            </w:r>
+          </w:p>
+        </w:tc>
+        <w:tc>
+          <w:tcPr>
+            <w:tcW w:type="dxa" w:w="5556"/>
+            <w:shd w:fill="EEF2FF" w:val="clear"/>
+            <w:tcBorders>
+              <w:top w:val="single" w:sz="4" w:color="CBD5E1"/>
+              <w:left w:val="single" w:sz="4" w:color="CBD5E1"/>
+              <w:bottom w:val="single" w:sz="4" w:color="CBD5E1"/>
+              <w:right w:val="single" w:sz="4" w:color="CBD5E1"/>
+            </w:tcBorders>
+          </w:tcPr>
+          <w:p>
+            <w:r/>
+            <w:r>
+              <w:rPr>
+                <w:rFonts w:ascii="Calibri" w:hAnsi="Calibri" w:eastAsia="Calibri"/>
+                <w:b w:val="0"/>
+                <w:color w:val="334155"/>
+                <w:sz w:val="19"/>
+              </w:rPr>
+              <w:t>Login local da sessão + UPN Azure</w:t>
+            </w:r>
+          </w:p>
+        </w:tc>
+      </w:tr>
+      <w:tr>
+        <w:tc>
+          <w:tcPr>
+            <w:tcW w:type="dxa" w:w="2948"/>
+            <w:shd w:fill="F8FAFC" w:val="clear"/>
+            <w:tcBorders>
+              <w:top w:val="single" w:sz="4" w:color="CBD5E1"/>
+              <w:left w:val="single" w:sz="4" w:color="CBD5E1"/>
+              <w:bottom w:val="single" w:sz="4" w:color="CBD5E1"/>
+              <w:right w:val="single" w:sz="4" w:color="CBD5E1"/>
+            </w:tcBorders>
+          </w:tcPr>
+          <w:p>
+            <w:r/>
+            <w:r>
+              <w:rPr>
+                <w:rFonts w:ascii="Calibri" w:hAnsi="Calibri" w:eastAsia="Calibri"/>
+                <w:b/>
+                <w:color w:val="334155"/>
+                <w:sz w:val="19"/>
+              </w:rPr>
+              <w:t>SSOI-FIRST</w:t>
+            </w:r>
+          </w:p>
+        </w:tc>
+        <w:tc>
+          <w:tcPr>
+            <w:tcW w:type="dxa" w:w="907"/>
+            <w:shd w:fill="F8FAFC" w:val="clear"/>
+            <w:tcBorders>
+              <w:top w:val="single" w:sz="4" w:color="CBD5E1"/>
+              <w:left w:val="single" w:sz="4" w:color="CBD5E1"/>
+              <w:bottom w:val="single" w:sz="4" w:color="CBD5E1"/>
+              <w:right w:val="single" w:sz="4" w:color="CBD5E1"/>
+            </w:tcBorders>
+          </w:tcPr>
+          <w:p>
+            <w:r/>
+            <w:r>
+              <w:rPr>
+                <w:rFonts w:ascii="Calibri" w:hAnsi="Calibri" w:eastAsia="Calibri"/>
+                <w:b w:val="0"/>
+                <w:color w:val="334155"/>
+                <w:sz w:val="19"/>
+              </w:rPr>
+              <w:t>I</w:t>
+            </w:r>
+          </w:p>
+        </w:tc>
+        <w:tc>
+          <w:tcPr>
+            <w:tcW w:type="dxa" w:w="5556"/>
+            <w:shd w:fill="F8FAFC" w:val="clear"/>
+            <w:tcBorders>
+              <w:top w:val="single" w:sz="4" w:color="CBD5E1"/>
+              <w:left w:val="single" w:sz="4" w:color="CBD5E1"/>
+              <w:bottom w:val="single" w:sz="4" w:color="CBD5E1"/>
+              <w:right w:val="single" w:sz="4" w:color="CBD5E1"/>
+            </w:tcBorders>
+          </w:tcPr>
+          <w:p>
+            <w:r/>
+            <w:r>
+              <w:rPr>
+                <w:rFonts w:ascii="Calibri" w:hAnsi="Calibri" w:eastAsia="Calibri"/>
+                <w:b w:val="0"/>
+                <w:color w:val="334155"/>
+                <w:sz w:val="19"/>
+              </w:rPr>
+              <w:t>Primeiro vínculo gravado (OID + UPN)</w:t>
+            </w:r>
+          </w:p>
+        </w:tc>
+      </w:tr>
+      <w:tr>
+        <w:tc>
+          <w:tcPr>
+            <w:tcW w:type="dxa" w:w="2948"/>
+            <w:shd w:fill="EEF2FF" w:val="clear"/>
+            <w:tcBorders>
+              <w:top w:val="single" w:sz="4" w:color="CBD5E1"/>
+              <w:left w:val="single" w:sz="4" w:color="CBD5E1"/>
+              <w:bottom w:val="single" w:sz="4" w:color="CBD5E1"/>
+              <w:right w:val="single" w:sz="4" w:color="CBD5E1"/>
+            </w:tcBorders>
+          </w:tcPr>
+          <w:p>
+            <w:r/>
+            <w:r>
+              <w:rPr>
+                <w:rFonts w:ascii="Calibri" w:hAnsi="Calibri" w:eastAsia="Calibri"/>
+                <w:b/>
+                <w:color w:val="334155"/>
+                <w:sz w:val="19"/>
+              </w:rPr>
+              <w:t>SSOI-LINK</w:t>
+            </w:r>
+          </w:p>
+        </w:tc>
+        <w:tc>
+          <w:tcPr>
+            <w:tcW w:type="dxa" w:w="907"/>
+            <w:shd w:fill="EEF2FF" w:val="clear"/>
+            <w:tcBorders>
+              <w:top w:val="single" w:sz="4" w:color="CBD5E1"/>
+              <w:left w:val="single" w:sz="4" w:color="CBD5E1"/>
+              <w:bottom w:val="single" w:sz="4" w:color="CBD5E1"/>
+              <w:right w:val="single" w:sz="4" w:color="CBD5E1"/>
+            </w:tcBorders>
+          </w:tcPr>
+          <w:p>
+            <w:r/>
+            <w:r>
+              <w:rPr>
+                <w:rFonts w:ascii="Calibri" w:hAnsi="Calibri" w:eastAsia="Calibri"/>
+                <w:b w:val="0"/>
+                <w:color w:val="334155"/>
+                <w:sz w:val="19"/>
+              </w:rPr>
+              <w:t>I</w:t>
+            </w:r>
+          </w:p>
+        </w:tc>
+        <w:tc>
+          <w:tcPr>
+            <w:tcW w:type="dxa" w:w="5556"/>
+            <w:shd w:fill="EEF2FF" w:val="clear"/>
+            <w:tcBorders>
+              <w:top w:val="single" w:sz="4" w:color="CBD5E1"/>
+              <w:left w:val="single" w:sz="4" w:color="CBD5E1"/>
+              <w:bottom w:val="single" w:sz="4" w:color="CBD5E1"/>
+              <w:right w:val="single" w:sz="4" w:color="CBD5E1"/>
+            </w:tcBorders>
+          </w:tcPr>
+          <w:p>
+            <w:r/>
+            <w:r>
+              <w:rPr>
+                <w:rFonts w:ascii="Calibri" w:hAnsi="Calibri" w:eastAsia="Calibri"/>
+                <w:b w:val="0"/>
+                <w:color w:val="334155"/>
+                <w:sz w:val="19"/>
+              </w:rPr>
+              <w:t>Mesmo OID: atualiza último login</w:t>
+            </w:r>
+          </w:p>
+        </w:tc>
+      </w:tr>
+      <w:tr>
+        <w:tc>
+          <w:tcPr>
+            <w:tcW w:type="dxa" w:w="2948"/>
+            <w:shd w:fill="F8FAFC" w:val="clear"/>
+            <w:tcBorders>
+              <w:top w:val="single" w:sz="4" w:color="CBD5E1"/>
+              <w:left w:val="single" w:sz="4" w:color="CBD5E1"/>
+              <w:bottom w:val="single" w:sz="4" w:color="CBD5E1"/>
+              <w:right w:val="single" w:sz="4" w:color="CBD5E1"/>
+            </w:tcBorders>
+          </w:tcPr>
+          <w:p>
+            <w:r/>
+            <w:r>
+              <w:rPr>
+                <w:rFonts w:ascii="Calibri" w:hAnsi="Calibri" w:eastAsia="Calibri"/>
+                <w:b/>
+                <w:color w:val="334155"/>
+                <w:sz w:val="19"/>
+              </w:rPr>
+              <w:t>(vazio) / Login SSO efetuado</w:t>
+            </w:r>
+          </w:p>
+        </w:tc>
+        <w:tc>
+          <w:tcPr>
+            <w:tcW w:type="dxa" w:w="907"/>
+            <w:shd w:fill="F8FAFC" w:val="clear"/>
+            <w:tcBorders>
+              <w:top w:val="single" w:sz="4" w:color="CBD5E1"/>
+              <w:left w:val="single" w:sz="4" w:color="CBD5E1"/>
+              <w:bottom w:val="single" w:sz="4" w:color="CBD5E1"/>
+              <w:right w:val="single" w:sz="4" w:color="CBD5E1"/>
+            </w:tcBorders>
+          </w:tcPr>
+          <w:p>
+            <w:r/>
+            <w:r>
+              <w:rPr>
+                <w:rFonts w:ascii="Calibri" w:hAnsi="Calibri" w:eastAsia="Calibri"/>
+                <w:b w:val="0"/>
+                <w:color w:val="334155"/>
+                <w:sz w:val="19"/>
+              </w:rPr>
+              <w:t>S</w:t>
+            </w:r>
+          </w:p>
+        </w:tc>
+        <w:tc>
+          <w:tcPr>
+            <w:tcW w:type="dxa" w:w="5556"/>
+            <w:shd w:fill="F8FAFC" w:val="clear"/>
+            <w:tcBorders>
+              <w:top w:val="single" w:sz="4" w:color="CBD5E1"/>
+              <w:left w:val="single" w:sz="4" w:color="CBD5E1"/>
+              <w:bottom w:val="single" w:sz="4" w:color="CBD5E1"/>
+              <w:right w:val="single" w:sz="4" w:color="CBD5E1"/>
+            </w:tcBorders>
+          </w:tcPr>
+          <w:p>
+            <w:r/>
+            <w:r>
+              <w:rPr>
+                <w:rFonts w:ascii="Calibri" w:hAnsi="Calibri" w:eastAsia="Calibri"/>
+                <w:b w:val="0"/>
+                <w:color w:val="334155"/>
+                <w:sz w:val="19"/>
+              </w:rPr>
+              <w:t>AuthenticatePortalSso aceito — sessão Portal</w:t>
+            </w:r>
+          </w:p>
+        </w:tc>
+      </w:tr>
+      <w:tr>
+        <w:tc>
+          <w:tcPr>
+            <w:tcW w:type="dxa" w:w="2948"/>
+            <w:shd w:fill="EEF2FF" w:val="clear"/>
+            <w:tcBorders>
+              <w:top w:val="single" w:sz="4" w:color="CBD5E1"/>
+              <w:left w:val="single" w:sz="4" w:color="CBD5E1"/>
+              <w:bottom w:val="single" w:sz="4" w:color="CBD5E1"/>
+              <w:right w:val="single" w:sz="4" w:color="CBD5E1"/>
+            </w:tcBorders>
+          </w:tcPr>
+          <w:p>
+            <w:r/>
+            <w:r>
+              <w:rPr>
+                <w:rFonts w:ascii="Calibri" w:hAnsi="Calibri" w:eastAsia="Calibri"/>
+                <w:b/>
+                <w:color w:val="334155"/>
+                <w:sz w:val="19"/>
+              </w:rPr>
+              <w:t>SSOF-OFF / CONT / START</w:t>
+            </w:r>
+          </w:p>
+        </w:tc>
+        <w:tc>
+          <w:tcPr>
+            <w:tcW w:type="dxa" w:w="907"/>
+            <w:shd w:fill="EEF2FF" w:val="clear"/>
+            <w:tcBorders>
+              <w:top w:val="single" w:sz="4" w:color="CBD5E1"/>
+              <w:left w:val="single" w:sz="4" w:color="CBD5E1"/>
+              <w:bottom w:val="single" w:sz="4" w:color="CBD5E1"/>
+              <w:right w:val="single" w:sz="4" w:color="CBD5E1"/>
+            </w:tcBorders>
+          </w:tcPr>
+          <w:p>
+            <w:r/>
+            <w:r>
+              <w:rPr>
+                <w:rFonts w:ascii="Calibri" w:hAnsi="Calibri" w:eastAsia="Calibri"/>
+                <w:b w:val="0"/>
+                <w:color w:val="334155"/>
+                <w:sz w:val="19"/>
+              </w:rPr>
+              <w:t>F</w:t>
+            </w:r>
+          </w:p>
+        </w:tc>
+        <w:tc>
+          <w:tcPr>
+            <w:tcW w:type="dxa" w:w="5556"/>
+            <w:shd w:fill="EEF2FF" w:val="clear"/>
+            <w:tcBorders>
+              <w:top w:val="single" w:sz="4" w:color="CBD5E1"/>
+              <w:left w:val="single" w:sz="4" w:color="CBD5E1"/>
+              <w:bottom w:val="single" w:sz="4" w:color="CBD5E1"/>
+              <w:right w:val="single" w:sz="4" w:color="CBD5E1"/>
+            </w:tcBorders>
+          </w:tcPr>
+          <w:p>
+            <w:r/>
+            <w:r>
+              <w:rPr>
+                <w:rFonts w:ascii="Calibri" w:hAnsi="Calibri" w:eastAsia="Calibri"/>
+                <w:b w:val="0"/>
+                <w:color w:val="334155"/>
+                <w:sz w:val="19"/>
+              </w:rPr>
+              <w:t>SSO desligado, contingência ou falha ao abrir a Microsoft</w:t>
+            </w:r>
+          </w:p>
+        </w:tc>
+      </w:tr>
+      <w:tr>
+        <w:tc>
+          <w:tcPr>
+            <w:tcW w:type="dxa" w:w="2948"/>
+            <w:shd w:fill="F8FAFC" w:val="clear"/>
+            <w:tcBorders>
+              <w:top w:val="single" w:sz="4" w:color="CBD5E1"/>
+              <w:left w:val="single" w:sz="4" w:color="CBD5E1"/>
+              <w:bottom w:val="single" w:sz="4" w:color="CBD5E1"/>
+              <w:right w:val="single" w:sz="4" w:color="CBD5E1"/>
+            </w:tcBorders>
+          </w:tcPr>
+          <w:p>
+            <w:r/>
+            <w:r>
+              <w:rPr>
+                <w:rFonts w:ascii="Calibri" w:hAnsi="Calibri" w:eastAsia="Calibri"/>
+                <w:b/>
+                <w:color w:val="334155"/>
+                <w:sz w:val="19"/>
+              </w:rPr>
+              <w:t>SSOF-AZURE / CODE / TOKEN</w:t>
+            </w:r>
+          </w:p>
+        </w:tc>
+        <w:tc>
+          <w:tcPr>
+            <w:tcW w:type="dxa" w:w="907"/>
+            <w:shd w:fill="F8FAFC" w:val="clear"/>
+            <w:tcBorders>
+              <w:top w:val="single" w:sz="4" w:color="CBD5E1"/>
+              <w:left w:val="single" w:sz="4" w:color="CBD5E1"/>
+              <w:bottom w:val="single" w:sz="4" w:color="CBD5E1"/>
+              <w:right w:val="single" w:sz="4" w:color="CBD5E1"/>
+            </w:tcBorders>
+          </w:tcPr>
+          <w:p>
+            <w:r/>
+            <w:r>
+              <w:rPr>
+                <w:rFonts w:ascii="Calibri" w:hAnsi="Calibri" w:eastAsia="Calibri"/>
+                <w:b w:val="0"/>
+                <w:color w:val="334155"/>
+                <w:sz w:val="19"/>
+              </w:rPr>
+              <w:t>F</w:t>
+            </w:r>
+          </w:p>
+        </w:tc>
+        <w:tc>
+          <w:tcPr>
+            <w:tcW w:type="dxa" w:w="5556"/>
+            <w:shd w:fill="F8FAFC" w:val="clear"/>
+            <w:tcBorders>
+              <w:top w:val="single" w:sz="4" w:color="CBD5E1"/>
+              <w:left w:val="single" w:sz="4" w:color="CBD5E1"/>
+              <w:bottom w:val="single" w:sz="4" w:color="CBD5E1"/>
+              <w:right w:val="single" w:sz="4" w:color="CBD5E1"/>
+            </w:tcBorders>
+          </w:tcPr>
+          <w:p>
+            <w:r/>
+            <w:r>
+              <w:rPr>
+                <w:rFonts w:ascii="Calibri" w:hAnsi="Calibri" w:eastAsia="Calibri"/>
+                <w:b w:val="0"/>
+                <w:color w:val="334155"/>
+                <w:sz w:val="19"/>
+              </w:rPr>
+              <w:t>Erro Azure no callback, sem code, ou falha ao trocar o token</w:t>
+            </w:r>
+          </w:p>
+        </w:tc>
+      </w:tr>
+      <w:tr>
+        <w:tc>
+          <w:tcPr>
+            <w:tcW w:type="dxa" w:w="2948"/>
+            <w:shd w:fill="EEF2FF" w:val="clear"/>
+            <w:tcBorders>
+              <w:top w:val="single" w:sz="4" w:color="CBD5E1"/>
+              <w:left w:val="single" w:sz="4" w:color="CBD5E1"/>
+              <w:bottom w:val="single" w:sz="4" w:color="CBD5E1"/>
+              <w:right w:val="single" w:sz="4" w:color="CBD5E1"/>
+            </w:tcBorders>
+          </w:tcPr>
+          <w:p>
+            <w:r/>
+            <w:r>
+              <w:rPr>
+                <w:rFonts w:ascii="Calibri" w:hAnsi="Calibri" w:eastAsia="Calibri"/>
+                <w:b/>
+                <w:color w:val="334155"/>
+                <w:sz w:val="19"/>
+              </w:rPr>
+              <w:t>SSOF-BIND / FIRST</w:t>
+            </w:r>
+          </w:p>
+        </w:tc>
+        <w:tc>
+          <w:tcPr>
+            <w:tcW w:type="dxa" w:w="907"/>
+            <w:shd w:fill="EEF2FF" w:val="clear"/>
+            <w:tcBorders>
+              <w:top w:val="single" w:sz="4" w:color="CBD5E1"/>
+              <w:left w:val="single" w:sz="4" w:color="CBD5E1"/>
+              <w:bottom w:val="single" w:sz="4" w:color="CBD5E1"/>
+              <w:right w:val="single" w:sz="4" w:color="CBD5E1"/>
+            </w:tcBorders>
+          </w:tcPr>
+          <w:p>
+            <w:r/>
+            <w:r>
+              <w:rPr>
+                <w:rFonts w:ascii="Calibri" w:hAnsi="Calibri" w:eastAsia="Calibri"/>
+                <w:b w:val="0"/>
+                <w:color w:val="334155"/>
+                <w:sz w:val="19"/>
+              </w:rPr>
+              <w:t>F</w:t>
+            </w:r>
+          </w:p>
+        </w:tc>
+        <w:tc>
+          <w:tcPr>
+            <w:tcW w:type="dxa" w:w="5556"/>
+            <w:shd w:fill="EEF2FF" w:val="clear"/>
+            <w:tcBorders>
+              <w:top w:val="single" w:sz="4" w:color="CBD5E1"/>
+              <w:left w:val="single" w:sz="4" w:color="CBD5E1"/>
+              <w:bottom w:val="single" w:sz="4" w:color="CBD5E1"/>
+              <w:right w:val="single" w:sz="4" w:color="CBD5E1"/>
+            </w:tcBorders>
+          </w:tcPr>
+          <w:p>
+            <w:r/>
+            <w:r>
+              <w:rPr>
+                <w:rFonts w:ascii="Calibri" w:hAnsi="Calibri" w:eastAsia="Calibri"/>
+                <w:b w:val="0"/>
+                <w:color w:val="334155"/>
+                <w:sz w:val="19"/>
+              </w:rPr>
+              <w:t>Bind falhou (login vazio, SQL, HTTP)</w:t>
+            </w:r>
+          </w:p>
+        </w:tc>
+      </w:tr>
+      <w:tr>
+        <w:tc>
+          <w:tcPr>
+            <w:tcW w:type="dxa" w:w="2948"/>
+            <w:shd w:fill="F8FAFC" w:val="clear"/>
+            <w:tcBorders>
+              <w:top w:val="single" w:sz="4" w:color="CBD5E1"/>
+              <w:left w:val="single" w:sz="4" w:color="CBD5E1"/>
+              <w:bottom w:val="single" w:sz="4" w:color="CBD5E1"/>
+              <w:right w:val="single" w:sz="4" w:color="CBD5E1"/>
+            </w:tcBorders>
+          </w:tcPr>
+          <w:p>
+            <w:r/>
+            <w:r>
+              <w:rPr>
+                <w:rFonts w:ascii="Calibri" w:hAnsi="Calibri" w:eastAsia="Calibri"/>
+                <w:b/>
+                <w:color w:val="334155"/>
+                <w:sz w:val="19"/>
+              </w:rPr>
+              <w:t>SSOF-LINK</w:t>
+            </w:r>
+          </w:p>
+        </w:tc>
+        <w:tc>
+          <w:tcPr>
+            <w:tcW w:type="dxa" w:w="907"/>
+            <w:shd w:fill="F8FAFC" w:val="clear"/>
+            <w:tcBorders>
+              <w:top w:val="single" w:sz="4" w:color="CBD5E1"/>
+              <w:left w:val="single" w:sz="4" w:color="CBD5E1"/>
+              <w:bottom w:val="single" w:sz="4" w:color="CBD5E1"/>
+              <w:right w:val="single" w:sz="4" w:color="CBD5E1"/>
+            </w:tcBorders>
+          </w:tcPr>
+          <w:p>
+            <w:r/>
+            <w:r>
+              <w:rPr>
+                <w:rFonts w:ascii="Calibri" w:hAnsi="Calibri" w:eastAsia="Calibri"/>
+                <w:b w:val="0"/>
+                <w:color w:val="334155"/>
+                <w:sz w:val="19"/>
+              </w:rPr>
+              <w:t>F</w:t>
+            </w:r>
+          </w:p>
+        </w:tc>
+        <w:tc>
+          <w:tcPr>
+            <w:tcW w:type="dxa" w:w="5556"/>
+            <w:shd w:fill="F8FAFC" w:val="clear"/>
+            <w:tcBorders>
+              <w:top w:val="single" w:sz="4" w:color="CBD5E1"/>
+              <w:left w:val="single" w:sz="4" w:color="CBD5E1"/>
+              <w:bottom w:val="single" w:sz="4" w:color="CBD5E1"/>
+              <w:right w:val="single" w:sz="4" w:color="CBD5E1"/>
+            </w:tcBorders>
+          </w:tcPr>
+          <w:p>
+            <w:r/>
+            <w:r>
+              <w:rPr>
+                <w:rFonts w:ascii="Calibri" w:hAnsi="Calibri" w:eastAsia="Calibri"/>
+                <w:b w:val="0"/>
+                <w:color w:val="334155"/>
+                <w:sz w:val="19"/>
+              </w:rPr>
+              <w:t>Conta Microsoft diferente da vinculada, ou OID de outro usuário</w:t>
+            </w:r>
+          </w:p>
+        </w:tc>
+      </w:tr>
+      <w:tr>
+        <w:tc>
+          <w:tcPr>
+            <w:tcW w:type="dxa" w:w="2948"/>
+            <w:shd w:fill="EEF2FF" w:val="clear"/>
+            <w:tcBorders>
+              <w:top w:val="single" w:sz="4" w:color="CBD5E1"/>
+              <w:left w:val="single" w:sz="4" w:color="CBD5E1"/>
+              <w:bottom w:val="single" w:sz="4" w:color="CBD5E1"/>
+              <w:right w:val="single" w:sz="4" w:color="CBD5E1"/>
+            </w:tcBorders>
+          </w:tcPr>
+          <w:p>
+            <w:r/>
+            <w:r>
+              <w:rPr>
+                <w:rFonts w:ascii="Calibri" w:hAnsi="Calibri" w:eastAsia="Calibri"/>
+                <w:b/>
+                <w:color w:val="334155"/>
+                <w:sz w:val="19"/>
+              </w:rPr>
+              <w:t>SSOF-EXC</w:t>
+            </w:r>
+          </w:p>
+        </w:tc>
+        <w:tc>
+          <w:tcPr>
+            <w:tcW w:type="dxa" w:w="907"/>
+            <w:shd w:fill="EEF2FF" w:val="clear"/>
+            <w:tcBorders>
+              <w:top w:val="single" w:sz="4" w:color="CBD5E1"/>
+              <w:left w:val="single" w:sz="4" w:color="CBD5E1"/>
+              <w:bottom w:val="single" w:sz="4" w:color="CBD5E1"/>
+              <w:right w:val="single" w:sz="4" w:color="CBD5E1"/>
+            </w:tcBorders>
+          </w:tcPr>
+          <w:p>
+            <w:r/>
+            <w:r>
+              <w:rPr>
+                <w:rFonts w:ascii="Calibri" w:hAnsi="Calibri" w:eastAsia="Calibri"/>
+                <w:b w:val="0"/>
+                <w:color w:val="334155"/>
+                <w:sz w:val="19"/>
+              </w:rPr>
+              <w:t>F</w:t>
+            </w:r>
+          </w:p>
+        </w:tc>
+        <w:tc>
+          <w:tcPr>
+            <w:tcW w:type="dxa" w:w="5556"/>
+            <w:shd w:fill="EEF2FF" w:val="clear"/>
+            <w:tcBorders>
+              <w:top w:val="single" w:sz="4" w:color="CBD5E1"/>
+              <w:left w:val="single" w:sz="4" w:color="CBD5E1"/>
+              <w:bottom w:val="single" w:sz="4" w:color="CBD5E1"/>
+              <w:right w:val="single" w:sz="4" w:color="CBD5E1"/>
+            </w:tcBorders>
+          </w:tcPr>
+          <w:p>
+            <w:r/>
+            <w:r>
+              <w:rPr>
+                <w:rFonts w:ascii="Calibri" w:hAnsi="Calibri" w:eastAsia="Calibri"/>
+                <w:b w:val="0"/>
+                <w:color w:val="334155"/>
+                <w:sz w:val="19"/>
+              </w:rPr>
+              <w:t>Exceção MSAL no callback</w:t>
+            </w:r>
+          </w:p>
+        </w:tc>
+      </w:tr>
+      <w:tr>
+        <w:tc>
+          <w:tcPr>
+            <w:tcW w:type="dxa" w:w="2948"/>
+            <w:shd w:fill="F8FAFC" w:val="clear"/>
+            <w:tcBorders>
+              <w:top w:val="single" w:sz="4" w:color="CBD5E1"/>
+              <w:left w:val="single" w:sz="4" w:color="CBD5E1"/>
+              <w:bottom w:val="single" w:sz="4" w:color="CBD5E1"/>
+              <w:right w:val="single" w:sz="4" w:color="CBD5E1"/>
+            </w:tcBorders>
+          </w:tcPr>
+          <w:p>
+            <w:r/>
+            <w:r>
+              <w:rPr>
+                <w:rFonts w:ascii="Calibri" w:hAnsi="Calibri" w:eastAsia="Calibri"/>
+                <w:b/>
+                <w:color w:val="334155"/>
+                <w:sz w:val="19"/>
+              </w:rPr>
+              <w:t>SSOI-REV</w:t>
+            </w:r>
+          </w:p>
+        </w:tc>
+        <w:tc>
+          <w:tcPr>
+            <w:tcW w:type="dxa" w:w="907"/>
+            <w:shd w:fill="F8FAFC" w:val="clear"/>
+            <w:tcBorders>
+              <w:top w:val="single" w:sz="4" w:color="CBD5E1"/>
+              <w:left w:val="single" w:sz="4" w:color="CBD5E1"/>
+              <w:bottom w:val="single" w:sz="4" w:color="CBD5E1"/>
+              <w:right w:val="single" w:sz="4" w:color="CBD5E1"/>
+            </w:tcBorders>
+          </w:tcPr>
+          <w:p>
+            <w:r/>
+            <w:r>
+              <w:rPr>
+                <w:rFonts w:ascii="Calibri" w:hAnsi="Calibri" w:eastAsia="Calibri"/>
+                <w:b w:val="0"/>
+                <w:color w:val="334155"/>
+                <w:sz w:val="19"/>
+              </w:rPr>
+              <w:t>I</w:t>
+            </w:r>
+          </w:p>
+        </w:tc>
+        <w:tc>
+          <w:tcPr>
+            <w:tcW w:type="dxa" w:w="5556"/>
+            <w:shd w:fill="F8FAFC" w:val="clear"/>
+            <w:tcBorders>
+              <w:top w:val="single" w:sz="4" w:color="CBD5E1"/>
+              <w:left w:val="single" w:sz="4" w:color="CBD5E1"/>
+              <w:bottom w:val="single" w:sz="4" w:color="CBD5E1"/>
+              <w:right w:val="single" w:sz="4" w:color="CBD5E1"/>
+            </w:tcBorders>
+          </w:tcPr>
+          <w:p>
+            <w:r/>
+            <w:r>
+              <w:rPr>
+                <w:rFonts w:ascii="Calibri" w:hAnsi="Calibri" w:eastAsia="Calibri"/>
+                <w:b w:val="0"/>
+                <w:color w:val="334155"/>
+                <w:sz w:val="19"/>
+              </w:rPr>
+              <w:t>Revogar SSO: apagou o vínculo (DESCRICAO inclui by=operador)</w:t>
+            </w:r>
+          </w:p>
+        </w:tc>
+      </w:tr>
+      <w:tr>
+        <w:tc>
+          <w:tcPr>
+            <w:tcW w:type="dxa" w:w="2948"/>
+            <w:shd w:fill="EEF2FF" w:val="clear"/>
+            <w:tcBorders>
+              <w:top w:val="single" w:sz="4" w:color="CBD5E1"/>
+              <w:left w:val="single" w:sz="4" w:color="CBD5E1"/>
+              <w:bottom w:val="single" w:sz="4" w:color="CBD5E1"/>
+              <w:right w:val="single" w:sz="4" w:color="CBD5E1"/>
+            </w:tcBorders>
+          </w:tcPr>
+          <w:p>
+            <w:r/>
+            <w:r>
+              <w:rPr>
+                <w:rFonts w:ascii="Calibri" w:hAnsi="Calibri" w:eastAsia="Calibri"/>
+                <w:b/>
+                <w:color w:val="334155"/>
+                <w:sz w:val="19"/>
+              </w:rPr>
+              <w:t>SSOF-REV</w:t>
+            </w:r>
+          </w:p>
+        </w:tc>
+        <w:tc>
+          <w:tcPr>
+            <w:tcW w:type="dxa" w:w="907"/>
+            <w:shd w:fill="EEF2FF" w:val="clear"/>
+            <w:tcBorders>
+              <w:top w:val="single" w:sz="4" w:color="CBD5E1"/>
+              <w:left w:val="single" w:sz="4" w:color="CBD5E1"/>
+              <w:bottom w:val="single" w:sz="4" w:color="CBD5E1"/>
+              <w:right w:val="single" w:sz="4" w:color="CBD5E1"/>
+            </w:tcBorders>
+          </w:tcPr>
+          <w:p>
+            <w:r/>
+            <w:r>
+              <w:rPr>
+                <w:rFonts w:ascii="Calibri" w:hAnsi="Calibri" w:eastAsia="Calibri"/>
+                <w:b w:val="0"/>
+                <w:color w:val="334155"/>
+                <w:sz w:val="19"/>
+              </w:rPr>
+              <w:t>F</w:t>
+            </w:r>
+          </w:p>
+        </w:tc>
+        <w:tc>
+          <w:tcPr>
+            <w:tcW w:type="dxa" w:w="5556"/>
+            <w:shd w:fill="EEF2FF" w:val="clear"/>
+            <w:tcBorders>
+              <w:top w:val="single" w:sz="4" w:color="CBD5E1"/>
+              <w:left w:val="single" w:sz="4" w:color="CBD5E1"/>
+              <w:bottom w:val="single" w:sz="4" w:color="CBD5E1"/>
+              <w:right w:val="single" w:sz="4" w:color="CBD5E1"/>
+            </w:tcBorders>
+          </w:tcPr>
+          <w:p>
+            <w:r/>
+            <w:r>
+              <w:rPr>
+                <w:rFonts w:ascii="Calibri" w:hAnsi="Calibri" w:eastAsia="Calibri"/>
+                <w:b w:val="0"/>
+                <w:color w:val="334155"/>
+                <w:sz w:val="19"/>
+              </w:rPr>
+              <w:t>Revogar SSO falhou (sem vínculo, usuário inexistente, SQL)</w:t>
+            </w:r>
+          </w:p>
+        </w:tc>
+      </w:tr>
+    </w:tbl>
+    <w:p/>
+    <w:p>
+      <w:pPr>
+        <w:spacing w:after="160" w:line="276" w:lineRule="auto"/>
+      </w:pPr>
+      <w:r>
+        <w:rPr>
+          <w:rFonts w:ascii="Calibri" w:hAnsi="Calibri" w:eastAsia="Calibri"/>
+          <w:b w:val="0"/>
+          <w:color w:val="334155"/>
+          <w:sz w:val="22"/>
+        </w:rPr>
+        <w:t>Depois de SSOI-REV o próximo SSO bem-sucedido volta a gravar SSOI-FIRST. CheckPortalSsoVinculo (consulta se há vínculo) não escreve na tabela.</w:t>
       </w:r>
     </w:p>
     <w:p>

</xml_diff>